<commit_message>
Restliche Dokumentation dem Repo hinzugefügt
</commit_message>
<xml_diff>
--- a/docs/Analyse.docx
+++ b/docs/Analyse.docx
@@ -193,6 +193,141 @@
           <w:t>String-Interpolation</w:t>
         </w:r>
       </w:hyperlink>
+    </w:p>
+    <w:p>
+      <w:r>
+        <w:br w:type="page"/>
+      </w:r>
+    </w:p>
+    <w:p>
+      <w:pPr>
+        <w:pStyle w:val="Heading1"/>
+      </w:pPr>
+      <w:r>
+        <w:t>Theoretische Abläufe</w:t>
+      </w:r>
+    </w:p>
+    <w:p>
+      <w:r>
+        <w:t>Die folgenden Beispiele beschreiben die Verarbeitung der Zellen als Pseudocode. Die Zellnummern beginnen bei 1. Im Array cells beginnt der Index dagegen bei 0. Vor jeder Änderung wird geprüft, ob die angegebenen Zellnummern gültig sind.</w:t>
+      </w:r>
+    </w:p>
+    <w:p>
+      <w:pPr>
+        <w:pStyle w:val="Heading2"/>
+      </w:pPr>
+      <w:r>
+        <w:t>Zellinhalt extrahieren</w:t>
+      </w:r>
+    </w:p>
+    <w:p>
+      <w:pPr>
+        <w:spacing w:after="120" w:line="240" w:lineRule="auto"/>
+      </w:pPr>
+      <w:r>
+        <w:rPr>
+          <w:rFonts w:ascii="Consolas" w:hAnsi="Consolas"/>
+          <w:sz w:val="18"/>
+        </w:rPr>
+        <w:t>Notebook-Datei als Text einlesen</w:t>
+        <w:br/>
+        <w:t>JSON in ein Notebook-Objekt umwandeln</w:t>
+        <w:br/>
+        <w:t>Zellnummer abfragen</w:t>
+        <w:br/>
+        <w:t>Wenn Zellnummer kleiner als 1 oder größer als Anzahl der Zellen:</w:t>
+        <w:br/>
+        <w:t xml:space="preserve">    Fehlermeldung anzeigen und Vorgang beenden</w:t>
+        <w:br/>
+        <w:t>Zelle aus cells an Position Zellnummer - 1 auswählen</w:t>
+        <w:br/>
+        <w:t>Wenn source eine Liste ist:</w:t>
+        <w:br/>
+        <w:t xml:space="preserve">    Alle Textteile ohne zusätzliches Trennzeichen zusammensetzen</w:t>
+        <w:br/>
+        <w:t>Sonst den einzelnen Text aus source übernehmen</w:t>
+        <w:br/>
+        <w:t>Den vollständigen Zellinhalt anzeigen</w:t>
+      </w:r>
+    </w:p>
+    <w:p>
+      <w:pPr>
+        <w:pStyle w:val="Heading2"/>
+      </w:pPr>
+      <w:r>
+        <w:t>Neue Zelle hinzufügen</w:t>
+      </w:r>
+    </w:p>
+    <w:p>
+      <w:pPr>
+        <w:spacing w:after="120" w:line="240" w:lineRule="auto"/>
+      </w:pPr>
+      <w:r>
+        <w:rPr>
+          <w:rFonts w:ascii="Consolas" w:hAnsi="Consolas"/>
+          <w:sz w:val="18"/>
+        </w:rPr>
+        <w:t>Notebook einlesen</w:t>
+        <w:br/>
+        <w:t>Zelltyp abfragen: code oder markdown</w:t>
+        <w:br/>
+        <w:t>Wenn Zelltyp ungültig ist:</w:t>
+        <w:br/>
+        <w:t xml:space="preserve">    Erneut nach dem Zelltyp fragen</w:t>
+        <w:br/>
+        <w:t>Text für die neue Zelle einlesen</w:t>
+        <w:br/>
+        <w:t>Neue Zelle mit Zelltyp, eindeutiger ID und leeren Metadaten erstellen</w:t>
+        <w:br/>
+        <w:t>Text als source übernehmen</w:t>
+        <w:br/>
+        <w:t>Wenn Zelltyp code ist:</w:t>
+        <w:br/>
+        <w:t xml:space="preserve">    outputs als leere Liste und execution_count als null setzen</w:t>
+        <w:br/>
+        <w:t>Neue Zelle am Ende von cells hinzufügen</w:t>
+      </w:r>
+    </w:p>
+    <w:p>
+      <w:pPr>
+        <w:pStyle w:val="Heading2"/>
+      </w:pPr>
+      <w:r>
+        <w:t>Zelle verschieben</w:t>
+      </w:r>
+    </w:p>
+    <w:p>
+      <w:pPr>
+        <w:spacing w:after="120" w:line="240" w:lineRule="auto"/>
+      </w:pPr>
+      <w:r>
+        <w:rPr>
+          <w:rFonts w:ascii="Consolas" w:hAnsi="Consolas"/>
+          <w:sz w:val="18"/>
+        </w:rPr>
+        <w:t>Notebook einlesen</w:t>
+        <w:br/>
+        <w:t>Zellnummer und Zielposition abfragen</w:t>
+        <w:br/>
+        <w:t>Wenn eine Position außerhalb von 1 bis Anzahl der Zellen liegt:</w:t>
+        <w:br/>
+        <w:t xml:space="preserve">    Fehlermeldung anzeigen und Vorgang beenden</w:t>
+        <w:br/>
+        <w:t>Zelle an Position Zellnummer - 1 merken</w:t>
+        <w:br/>
+        <w:t>Zelle aus cells entfernen</w:t>
+        <w:br/>
+        <w:t>Gemerkte Zelle an Position Zielposition - 1 einfügen</w:t>
+        <w:br/>
+        <w:t>Die Zielposition bezeichnet die Position im fertigen Notebook</w:t>
+        <w:br/>
+        <w:t>Inhalt, Zelltyp und Metadaten der Zelle bleiben erhalten</w:t>
+      </w:r>
+    </w:p>
+    <w:p>
+      <w:r>
+        <w:t>Nach dem Hinzufügen oder Verschieben wird das geänderte Notebook mit Serialize wieder in JSON umgewandelt und in eine neue Datei geschrieben. Vorhandene Dateien werden nicht überschrieben. Beim Extrahieren wird die Datei nur gelesen.</w:t>
+      </w:r>
     </w:p>
     <w:sectPr>
       <w:pgSz w:w="11906" w:h="16838"/>

</xml_diff>